<commit_message>
ajout de tests unitaires
</commit_message>
<xml_diff>
--- a/templates/courrier.docx
+++ b/templates/courrier.docx
@@ -12,12 +12,27 @@
     </w:p>
     <w:p>
       <w:r>
-        <w:t xml:space="preserve">Référence : CR-${courrier.subjectId}</w:t>
+        <w:t xml:space="preserve">Référence : ${courrier.reference}</w:t>
       </w:r>
     </w:p>
     <w:p>
       <w:r>
-        <w:t xml:space="preserve">Organisation : ${courrier.organisationId}</w:t>
+        <w:t xml:space="preserve">Sens : ${courrier.sens} — Statut : ${courrier.statut}</w:t>
+      </w:r>
+    </w:p>
+    <w:p>
+      <w:r>
+        <w:t xml:space="preserve">Date : ${courrier.dateCourrier}</w:t>
+      </w:r>
+    </w:p>
+    <w:p>
+      <w:r>
+        <w:t xml:space="preserve">Canal : ${courrier.canal}</w:t>
+      </w:r>
+    </w:p>
+    <w:p>
+      <w:r>
+        <w:t xml:space="preserve">Id : CR-${courrier.subjectId}</w:t>
       </w:r>
     </w:p>
     <w:p>
@@ -27,12 +42,17 @@
     </w:p>
     <w:p>
       <w:r>
-        <w:t xml:space="preserve">Objet : ________________________________</w:t>
+        <w:t xml:space="preserve">Objet : ${courrier.objet}</w:t>
       </w:r>
     </w:p>
     <w:p>
       <w:r>
-        <w:t xml:space="preserve">Destinataire : __________________________</w:t>
+        <w:t xml:space="preserve">Expéditeur : ${courrier.expediteur}</w:t>
+      </w:r>
+    </w:p>
+    <w:p>
+      <w:r>
+        <w:t xml:space="preserve">Destinataire : ${courrier.destinataire}</w:t>
       </w:r>
     </w:p>
     <w:p>
@@ -52,7 +72,7 @@
     </w:p>
     <w:p>
       <w:r>
-        <w:t xml:space="preserve">[Votre contenu ici]</w:t>
+        <w:t xml:space="preserve">${courrier.notes}</w:t>
       </w:r>
     </w:p>
     <w:p>

</xml_diff>